<commit_message>
release: entrega #1 finalizada
- docs: modificación del README y adición del apartado de pruebas en el documento .docx
- test: adición de la carpeta de pruebas con los archivos y scripts correspondientes
- fix(laravel): corrección de la lógica de password_reset en UserController
- fix(deps): corrección del archivo requirements.txt en Django, Flask Inventario y Flask Pedidos
- chore: adición de plantillas .env.example en los dos microservicios de Flask
</commit_message>
<xml_diff>
--- a/Proyecto(tienda).docx
+++ b/Proyecto(tienda).docx
@@ -591,7 +591,7 @@
         <w:pStyle w:val="Heading1"/>
         <w:numPr>
           <w:ilvl w:val="0"/>
-          <w:numId w:val="2"/>
+          <w:numId w:val="3"/>
         </w:numPr>
         <w:ind w:left="720" w:hanging="360"/>
         <w:rPr>
@@ -639,12 +639,12 @@
             <wp:extent cx="5731200" cy="4292600"/>
             <wp:effectExtent b="0" l="0" r="0" t="0"/>
             <wp:wrapSquare wrapText="bothSides" distB="114300" distT="114300" distL="114300" distR="114300"/>
-            <wp:docPr id="1" name="image1.png"/>
+            <wp:docPr id="1" name="image4.png"/>
             <a:graphic>
               <a:graphicData uri="http://schemas.openxmlformats.org/drawingml/2006/picture">
                 <pic:pic>
                   <pic:nvPicPr>
-                    <pic:cNvPr id="0" name="image1.png"/>
+                    <pic:cNvPr id="0" name="image4.png"/>
                     <pic:cNvPicPr preferRelativeResize="0"/>
                   </pic:nvPicPr>
                   <pic:blipFill>
@@ -4537,18 +4537,259 @@
     <w:p>
       <w:pPr>
         <w:pStyle w:val="Heading1"/>
-        <w:rPr/>
+        <w:numPr>
+          <w:ilvl w:val="0"/>
+          <w:numId w:val="2"/>
+        </w:numPr>
+        <w:ind w:left="720" w:hanging="360"/>
+        <w:rPr>
+          <w:rFonts w:ascii="Georgia" w:cs="Georgia" w:eastAsia="Georgia" w:hAnsi="Georgia"/>
+          <w:b w:val="1"/>
+          <w:bCs w:val="1"/>
+          <w:sz w:val="32"/>
+          <w:szCs w:val="32"/>
+          <w:u w:val="none"/>
+        </w:rPr>
       </w:pPr>
       <w:bookmarkStart w:colFirst="0" w:colLast="0" w:name="_t98j6cpomzuu" w:id="26"/>
       <w:bookmarkEnd w:id="26"/>
       <w:r>
         <w:rPr>
+          <w:rFonts w:ascii="Georgia" w:cs="Georgia" w:eastAsia="Georgia" w:hAnsi="Georgia"/>
+          <w:b w:val="1"/>
+          <w:bCs w:val="1"/>
+          <w:sz w:val="32"/>
+          <w:szCs w:val="32"/>
+          <w:rtl w:val="0"/>
+        </w:rPr>
+        <w:t xml:space="preserve">Pruebas:</w:t>
+      </w:r>
+      <w:r>
+        <w:rPr>
+          <w:rtl w:val="0"/>
+        </w:rPr>
+      </w:r>
+    </w:p>
+    <w:p>
+      <w:pPr>
+        <w:rPr/>
+      </w:pPr>
+      <w:r>
+        <w:rPr>
+          <w:rtl w:val="0"/>
+        </w:rPr>
+      </w:r>
+    </w:p>
+    <w:p>
+      <w:pPr>
+        <w:pStyle w:val="Heading2"/>
+        <w:ind w:left="720" w:firstLine="0"/>
+        <w:rPr>
+          <w:rFonts w:ascii="Georgia" w:cs="Georgia" w:eastAsia="Georgia" w:hAnsi="Georgia"/>
+          <w:sz w:val="28"/>
+          <w:szCs w:val="28"/>
+        </w:rPr>
+      </w:pPr>
+      <w:bookmarkStart w:colFirst="0" w:colLast="0" w:name="_klltrqnuse8w" w:id="27"/>
+      <w:bookmarkEnd w:id="27"/>
+      <w:r>
+        <w:rPr>
+          <w:rFonts w:ascii="Georgia" w:cs="Georgia" w:eastAsia="Georgia" w:hAnsi="Georgia"/>
+          <w:sz w:val="28"/>
+          <w:szCs w:val="28"/>
+          <w:rtl w:val="0"/>
+        </w:rPr>
+        <w:t xml:space="preserve">Pruebas unitarias:</w:t>
+      </w:r>
+    </w:p>
+    <w:p>
+      <w:pPr>
+        <w:rPr/>
+      </w:pPr>
+      <w:r>
+        <w:rPr>
+          <w:rtl w:val="0"/>
+        </w:rPr>
+      </w:r>
+      <w:r>
+        <w:drawing>
+          <wp:anchor allowOverlap="1" behindDoc="0" distB="114300" distT="114300" distL="114300" distR="114300" hidden="0" layoutInCell="1" locked="0" relativeHeight="0" simplePos="0">
+            <wp:simplePos x="0" y="0"/>
+            <wp:positionH relativeFrom="column">
+              <wp:posOffset>19051</wp:posOffset>
+            </wp:positionH>
+            <wp:positionV relativeFrom="paragraph">
+              <wp:posOffset>203788</wp:posOffset>
+            </wp:positionV>
+            <wp:extent cx="5731200" cy="3873500"/>
+            <wp:effectExtent b="0" l="0" r="0" t="0"/>
+            <wp:wrapSquare wrapText="bothSides" distB="114300" distT="114300" distL="114300" distR="114300"/>
+            <wp:docPr id="4" name="image2.png"/>
+            <a:graphic>
+              <a:graphicData uri="http://schemas.openxmlformats.org/drawingml/2006/picture">
+                <pic:pic>
+                  <pic:nvPicPr>
+                    <pic:cNvPr id="0" name="image2.png"/>
+                    <pic:cNvPicPr preferRelativeResize="0"/>
+                  </pic:nvPicPr>
+                  <pic:blipFill>
+                    <a:blip r:embed="rId7"/>
+                    <a:srcRect b="0" l="0" r="0" t="0"/>
+                    <a:stretch>
+                      <a:fillRect/>
+                    </a:stretch>
+                  </pic:blipFill>
+                  <pic:spPr>
+                    <a:xfrm>
+                      <a:off x="0" y="0"/>
+                      <a:ext cx="5731200" cy="3873500"/>
+                    </a:xfrm>
+                    <a:prstGeom prst="rect"/>
+                    <a:ln/>
+                  </pic:spPr>
+                </pic:pic>
+              </a:graphicData>
+            </a:graphic>
+          </wp:anchor>
+        </w:drawing>
+      </w:r>
+    </w:p>
+    <w:p>
+      <w:pPr>
+        <w:rPr/>
+      </w:pPr>
+      <w:r>
+        <w:rPr>
+          <w:rtl w:val="0"/>
+        </w:rPr>
+        <w:t xml:space="preserve">Se efectúa un login al inicio para que todo funcione correctamente desde el api gateway.</w:t>
+      </w:r>
+      <w:r>
+        <w:rPr>
+          <w:rtl w:val="0"/>
+        </w:rPr>
+      </w:r>
+    </w:p>
+    <w:p>
+      <w:pPr>
+        <w:rPr/>
+      </w:pPr>
+      <w:r>
+        <w:rPr>
+          <w:rtl w:val="0"/>
+        </w:rPr>
+      </w:r>
+    </w:p>
+    <w:p>
+      <w:pPr>
+        <w:rPr/>
+      </w:pPr>
+      <w:r>
+        <w:rPr>
+          <w:rtl w:val="0"/>
+        </w:rPr>
+      </w:r>
+    </w:p>
+    <w:p>
+      <w:pPr>
+        <w:rPr/>
+      </w:pPr>
+      <w:r>
+        <w:rPr>
+          <w:rtl w:val="0"/>
+        </w:rPr>
+        <w:t xml:space="preserve"> Pruebas del API GATEWAY(login):</w:t>
+      </w:r>
+      <w:r>
+        <w:drawing>
+          <wp:anchor allowOverlap="1" behindDoc="0" distB="114300" distT="114300" distL="114300" distR="114300" hidden="0" layoutInCell="1" locked="0" relativeHeight="0" simplePos="0">
+            <wp:simplePos x="0" y="0"/>
+            <wp:positionH relativeFrom="column">
+              <wp:posOffset>19051</wp:posOffset>
+            </wp:positionH>
+            <wp:positionV relativeFrom="paragraph">
+              <wp:posOffset>114300</wp:posOffset>
+            </wp:positionV>
+            <wp:extent cx="5731200" cy="3441700"/>
+            <wp:effectExtent b="0" l="0" r="0" t="0"/>
+            <wp:wrapSquare wrapText="bothSides" distB="114300" distT="114300" distL="114300" distR="114300"/>
+            <wp:docPr id="2" name="image1.png"/>
+            <a:graphic>
+              <a:graphicData uri="http://schemas.openxmlformats.org/drawingml/2006/picture">
+                <pic:pic>
+                  <pic:nvPicPr>
+                    <pic:cNvPr id="0" name="image1.png"/>
+                    <pic:cNvPicPr preferRelativeResize="0"/>
+                  </pic:nvPicPr>
+                  <pic:blipFill>
+                    <a:blip r:embed="rId8"/>
+                    <a:srcRect b="0" l="0" r="0" t="0"/>
+                    <a:stretch>
+                      <a:fillRect/>
+                    </a:stretch>
+                  </pic:blipFill>
+                  <pic:spPr>
+                    <a:xfrm>
+                      <a:off x="0" y="0"/>
+                      <a:ext cx="5731200" cy="3441700"/>
+                    </a:xfrm>
+                    <a:prstGeom prst="rect"/>
+                    <a:ln/>
+                  </pic:spPr>
+                </pic:pic>
+              </a:graphicData>
+            </a:graphic>
+          </wp:anchor>
+        </w:drawing>
+      </w:r>
+    </w:p>
+    <w:p>
+      <w:pPr>
+        <w:rPr/>
+      </w:pPr>
+      <w:r>
+        <w:rPr/>
+        <w:drawing>
+          <wp:inline distB="114300" distT="114300" distL="114300" distR="114300">
+            <wp:extent cx="5731200" cy="2362200"/>
+            <wp:effectExtent b="0" l="0" r="0" t="0"/>
+            <wp:docPr id="3" name="image3.png"/>
+            <a:graphic>
+              <a:graphicData uri="http://schemas.openxmlformats.org/drawingml/2006/picture">
+                <pic:pic>
+                  <pic:nvPicPr>
+                    <pic:cNvPr id="0" name="image3.png"/>
+                    <pic:cNvPicPr preferRelativeResize="0"/>
+                  </pic:nvPicPr>
+                  <pic:blipFill>
+                    <a:blip r:embed="rId9"/>
+                    <a:srcRect b="0" l="0" r="0" t="0"/>
+                    <a:stretch>
+                      <a:fillRect/>
+                    </a:stretch>
+                  </pic:blipFill>
+                  <pic:spPr>
+                    <a:xfrm>
+                      <a:off x="0" y="0"/>
+                      <a:ext cx="5731200" cy="2362200"/>
+                    </a:xfrm>
+                    <a:prstGeom prst="rect"/>
+                    <a:ln/>
+                  </pic:spPr>
+                </pic:pic>
+              </a:graphicData>
+            </a:graphic>
+          </wp:inline>
+        </w:drawing>
+      </w:r>
+      <w:r>
+        <w:rPr>
           <w:rtl w:val="0"/>
         </w:rPr>
       </w:r>
     </w:p>
     <w:sectPr>
-      <w:headerReference r:id="rId7" w:type="default"/>
+      <w:headerReference r:id="rId10" w:type="default"/>
       <w:pgSz w:h="16834" w:w="11909" w:orient="portrait"/>
       <w:pgMar w:bottom="1440" w:top="1440" w:left="1440" w:right="1440" w:header="720" w:footer="720"/>
       <w:pgNumType w:start="1"/>
@@ -4794,11 +5035,124 @@
       </w:rPr>
     </w:lvl>
   </w:abstractNum>
+  <w:abstractNum w:abstractNumId="3">
+    <w:lvl w:ilvl="0">
+      <w:start w:val="1"/>
+      <w:numFmt w:val="bullet"/>
+      <w:lvlText w:val="●"/>
+      <w:lvlJc w:val="left"/>
+      <w:pPr>
+        <w:ind w:left="720" w:hanging="360"/>
+      </w:pPr>
+      <w:rPr>
+        <w:u w:val="none"/>
+      </w:rPr>
+    </w:lvl>
+    <w:lvl w:ilvl="1">
+      <w:start w:val="1"/>
+      <w:numFmt w:val="bullet"/>
+      <w:lvlText w:val="○"/>
+      <w:lvlJc w:val="left"/>
+      <w:pPr>
+        <w:ind w:left="1440" w:hanging="360"/>
+      </w:pPr>
+      <w:rPr>
+        <w:u w:val="none"/>
+      </w:rPr>
+    </w:lvl>
+    <w:lvl w:ilvl="2">
+      <w:start w:val="1"/>
+      <w:numFmt w:val="bullet"/>
+      <w:lvlText w:val="■"/>
+      <w:lvlJc w:val="left"/>
+      <w:pPr>
+        <w:ind w:left="2160" w:hanging="360"/>
+      </w:pPr>
+      <w:rPr>
+        <w:u w:val="none"/>
+      </w:rPr>
+    </w:lvl>
+    <w:lvl w:ilvl="3">
+      <w:start w:val="1"/>
+      <w:numFmt w:val="bullet"/>
+      <w:lvlText w:val="●"/>
+      <w:lvlJc w:val="left"/>
+      <w:pPr>
+        <w:ind w:left="2880" w:hanging="360"/>
+      </w:pPr>
+      <w:rPr>
+        <w:u w:val="none"/>
+      </w:rPr>
+    </w:lvl>
+    <w:lvl w:ilvl="4">
+      <w:start w:val="1"/>
+      <w:numFmt w:val="bullet"/>
+      <w:lvlText w:val="○"/>
+      <w:lvlJc w:val="left"/>
+      <w:pPr>
+        <w:ind w:left="3600" w:hanging="360"/>
+      </w:pPr>
+      <w:rPr>
+        <w:u w:val="none"/>
+      </w:rPr>
+    </w:lvl>
+    <w:lvl w:ilvl="5">
+      <w:start w:val="1"/>
+      <w:numFmt w:val="bullet"/>
+      <w:lvlText w:val="■"/>
+      <w:lvlJc w:val="left"/>
+      <w:pPr>
+        <w:ind w:left="4320" w:hanging="360"/>
+      </w:pPr>
+      <w:rPr>
+        <w:u w:val="none"/>
+      </w:rPr>
+    </w:lvl>
+    <w:lvl w:ilvl="6">
+      <w:start w:val="1"/>
+      <w:numFmt w:val="bullet"/>
+      <w:lvlText w:val="●"/>
+      <w:lvlJc w:val="left"/>
+      <w:pPr>
+        <w:ind w:left="5040" w:hanging="360"/>
+      </w:pPr>
+      <w:rPr>
+        <w:u w:val="none"/>
+      </w:rPr>
+    </w:lvl>
+    <w:lvl w:ilvl="7">
+      <w:start w:val="1"/>
+      <w:numFmt w:val="bullet"/>
+      <w:lvlText w:val="○"/>
+      <w:lvlJc w:val="left"/>
+      <w:pPr>
+        <w:ind w:left="5760" w:hanging="360"/>
+      </w:pPr>
+      <w:rPr>
+        <w:u w:val="none"/>
+      </w:rPr>
+    </w:lvl>
+    <w:lvl w:ilvl="8">
+      <w:start w:val="1"/>
+      <w:numFmt w:val="bullet"/>
+      <w:lvlText w:val="■"/>
+      <w:lvlJc w:val="left"/>
+      <w:pPr>
+        <w:ind w:left="6480" w:hanging="360"/>
+      </w:pPr>
+      <w:rPr>
+        <w:u w:val="none"/>
+      </w:rPr>
+    </w:lvl>
+  </w:abstractNum>
   <w:num w:numId="1">
     <w:abstractNumId w:val="1"/>
   </w:num>
   <w:num w:numId="2">
     <w:abstractNumId w:val="2"/>
+  </w:num>
+  <w:num w:numId="3">
+    <w:abstractNumId w:val="3"/>
   </w:num>
 </w:numbering>
 </file>

</xml_diff>